<commit_message>
Modo sin conexión (PWA), arranque en segundo plano y nuevos reportes PDF
Agrega service worker, manifiesto e íconos para usar la app instalada y sin
wifi, con cola de operaciones idempotentes (operaciones_cliente). Incluye
scripts para iniciar/detener el servidor en segundo plano, listas de
asistencia e ICFES en PDF, paz y salvo de servicio social y ajustes en
SAPRED, constancias y fichas.

Co-Authored-By: Claude Opus 5.5 <noreply@anthropic.com>
</commit_message>
<xml_diff>
--- a/backend/plantillas/constancia_estudio.docx
+++ b/backend/plantillas/constancia_estudio.docx
@@ -883,7 +883,7 @@
           <w:lang w:eastAsia="es-CO"/>
         </w:rPr>
         <w:drawing>
-          <wp:anchor distT="0" distB="0" distL="114300" distR="114300" simplePos="0" relativeHeight="251673600" behindDoc="1" locked="0" layoutInCell="1" allowOverlap="1" wp14:anchorId="66C2B94D" wp14:editId="2DF77548">
+          <wp:anchor distT="0" distB="0" distL="114300" distR="114300" simplePos="0" relativeHeight="251673600" behindDoc="0" locked="0" layoutInCell="1" allowOverlap="1" wp14:anchorId="66C2B94D" wp14:editId="2DF77548">
             <wp:simplePos x="0" y="0"/>
             <wp:positionH relativeFrom="margin">
               <wp:align>left</wp:align>
@@ -891,7 +891,7 @@
             <wp:positionV relativeFrom="paragraph">
               <wp:posOffset>159011</wp:posOffset>
             </wp:positionV>
-            <wp:extent cx="1277471" cy="933450"/>
+            <wp:extent cx="1965960" cy="789709"/>
             <wp:effectExtent l="0" t="0" r="0" b="0"/>
             <wp:wrapNone/>
             <wp:docPr id="1323808928" name="Imagen 1323808928" descr="C:\Users\ADMIN\Desktop\IMG-20200514-WA0007.jpg"/>
@@ -908,29 +908,14 @@
                     </pic:cNvPicPr>
                   </pic:nvPicPr>
                   <pic:blipFill rotWithShape="1">
-                    <a:blip r:embed="rId6" cstate="print">
-                      <a:extLst>
-                        <a:ext uri="{BEBA8EAE-BF5A-486C-A8C5-ECC9F3942E4B}">
-                          <a14:imgProps xmlns:a14="http://schemas.microsoft.com/office/drawing/2010/main">
-                            <a14:imgLayer r:embed="rId7">
-                              <a14:imgEffect>
-                                <a14:brightnessContrast bright="40000" contrast="-40000"/>
-                              </a14:imgEffect>
-                            </a14:imgLayer>
-                          </a14:imgProps>
-                        </a:ext>
-                        <a:ext uri="{28A0092B-C50C-407E-A947-70E740481C1C}">
-                          <a14:useLocalDpi xmlns:a14="http://schemas.microsoft.com/office/drawing/2010/main" val="0"/>
-                        </a:ext>
-                      </a:extLst>
-                    </a:blip>
-                    <a:srcRect l="25372" t="11448" r="42194" b="37583"/>
+                    <a:blip r:embed="rId6"/>
+                    <a:srcRect/>
                     <a:stretch/>
                   </pic:blipFill>
                   <pic:spPr bwMode="auto">
                     <a:xfrm>
                       <a:off x="0" y="0"/>
-                      <a:ext cx="1277471" cy="933450"/>
+                      <a:ext cx="1965960" cy="789709"/>
                     </a:xfrm>
                     <a:prstGeom prst="rect">
                       <a:avLst/>
@@ -1281,7 +1266,7 @@
           <w:rStyle w:val="Hipervnculo"/>
           <w:sz w:val="18"/>
         </w:rPr>
-        <w:t>ietabaawa@yahoo.es</w:t>
+        <w:t>awa@ietaba.edu.co</w:t>
       </w:r>
     </w:hyperlink>
   </w:p>

</xml_diff>